<commit_message>
added Kakulin student report
</commit_message>
<xml_diff>
--- a/2s.docx
+++ b/2s.docx
@@ -17,10 +17,7 @@
         <w:t xml:space="preserve">Координатор добавил меня в соавторы репозитория </w:t>
       </w:r>
       <w:r>
-        <w:t>LR9Finalwork</w:t>
-      </w:r>
-      <w:r>
-        <w:t xml:space="preserve">. </w:t>
+        <w:t xml:space="preserve">LR9Finalwork. </w:t>
       </w:r>
       <w:r>
         <w:t>На указанную при регистрации почту пришло письмо-приглашение. Я перешел по ссылке и принял приглашение.</w:t>
@@ -31,6 +28,9 @@
         <w:jc w:val="center"/>
       </w:pPr>
       <w:r>
+        <w:rPr>
+          <w:noProof/>
+        </w:rPr>
         <w:drawing>
           <wp:inline distT="0" distB="0" distL="0" distR="0" wp14:anchorId="48F352E9" wp14:editId="577F21E1">
             <wp:extent cx="4285556" cy="1623060"/>
@@ -101,11 +101,6 @@
       </w:hyperlink>
     </w:p>
     <w:p>
-      <w:pPr>
-        <w:rPr>
-          <w:lang w:val="en-US"/>
-        </w:rPr>
-      </w:pPr>
       <w:r>
         <w:t xml:space="preserve">В результате была создана папка </w:t>
       </w:r>
@@ -117,22 +112,50 @@
       </w:r>
     </w:p>
     <w:p>
-      <w:pPr>
-        <w:rPr>
-          <w:lang w:val="en-US"/>
-        </w:rPr>
-      </w:pPr>
-      <w:r>
-        <w:rPr>
-          <w:lang w:val="en-US"/>
-        </w:rPr>
-        <w:t>cd “</w:t>
-      </w:r>
-      <w:r>
-        <w:rPr>
-          <w:lang w:val="en-US"/>
-        </w:rPr>
-        <w:t>C:\Users\Влад\Desktop\PSU\</w:t>
+      <w:r>
+        <w:rPr>
+          <w:lang w:val="en-US"/>
+        </w:rPr>
+        <w:t>cd</w:t>
+      </w:r>
+      <w:r>
+        <w:t xml:space="preserve"> “</w:t>
+      </w:r>
+      <w:r>
+        <w:rPr>
+          <w:lang w:val="en-US"/>
+        </w:rPr>
+        <w:t>C</w:t>
+      </w:r>
+      <w:r>
+        <w:t>:\</w:t>
+      </w:r>
+      <w:r>
+        <w:rPr>
+          <w:lang w:val="en-US"/>
+        </w:rPr>
+        <w:t>Users</w:t>
+      </w:r>
+      <w:r>
+        <w:t>\Влад\</w:t>
+      </w:r>
+      <w:r>
+        <w:rPr>
+          <w:lang w:val="en-US"/>
+        </w:rPr>
+        <w:t>Desktop</w:t>
+      </w:r>
+      <w:r>
+        <w:t>\</w:t>
+      </w:r>
+      <w:r>
+        <w:rPr>
+          <w:lang w:val="en-US"/>
+        </w:rPr>
+        <w:t>PSU</w:t>
+      </w:r>
+      <w:r>
+        <w:t>\</w:t>
       </w:r>
       <w:proofErr w:type="spellStart"/>
       <w:r>
@@ -143,15 +166,35 @@
       </w:r>
       <w:proofErr w:type="spellEnd"/>
       <w:r>
-        <w:rPr>
-          <w:lang w:val="en-US"/>
-        </w:rPr>
-        <w:t>\lab9\LR9FinalWork</w:t>
-      </w:r>
-      <w:r>
-        <w:rPr>
-          <w:lang w:val="en-US"/>
-        </w:rPr>
+        <w:t>\</w:t>
+      </w:r>
+      <w:r>
+        <w:rPr>
+          <w:lang w:val="en-US"/>
+        </w:rPr>
+        <w:t>lab</w:t>
+      </w:r>
+      <w:r>
+        <w:t>9\</w:t>
+      </w:r>
+      <w:r>
+        <w:rPr>
+          <w:lang w:val="en-US"/>
+        </w:rPr>
+        <w:t>LR</w:t>
+      </w:r>
+      <w:r>
+        <w:t>9</w:t>
+      </w:r>
+      <w:proofErr w:type="spellStart"/>
+      <w:r>
+        <w:rPr>
+          <w:lang w:val="en-US"/>
+        </w:rPr>
+        <w:t>FinalWork</w:t>
+      </w:r>
+      <w:proofErr w:type="spellEnd"/>
+      <w:r>
         <w:t>”</w:t>
       </w:r>
     </w:p>
@@ -164,6 +207,7 @@
       </w:pPr>
       <w:r>
         <w:rPr>
+          <w:noProof/>
           <w:lang w:val="en-US"/>
         </w:rPr>
         <w:drawing>
@@ -205,9 +249,6 @@
     </w:p>
     <w:p>
       <w:r>
-        <w:rPr>
-          <w:lang w:val="en-US"/>
-        </w:rPr>
         <w:t>4</w:t>
       </w:r>
       <w:r>
@@ -254,6 +295,7 @@
       </w:pPr>
       <w:r>
         <w:rPr>
+          <w:noProof/>
           <w:lang w:val="en-US"/>
         </w:rPr>
         <w:drawing>
@@ -360,6 +402,9 @@
         <w:jc w:val="center"/>
       </w:pPr>
       <w:r>
+        <w:rPr>
+          <w:noProof/>
+        </w:rPr>
         <w:drawing>
           <wp:inline distT="0" distB="0" distL="0" distR="0" wp14:anchorId="0A328478" wp14:editId="399FAA6A">
             <wp:extent cx="4468805" cy="1447406"/>
@@ -408,9 +453,6 @@
     <w:p>
       <w:pPr>
         <w:ind w:left="708" w:hanging="708"/>
-        <w:rPr>
-          <w:lang w:val="en-US"/>
-        </w:rPr>
       </w:pPr>
       <w:r>
         <w:t>После внесения изменений я зафиксировал их с осмысленным сообщением:</w:t>
@@ -488,6 +530,7 @@
       </w:pPr>
       <w:r>
         <w:rPr>
+          <w:noProof/>
           <w:lang w:val="en-US"/>
         </w:rPr>
         <w:drawing>
@@ -563,6 +606,610 @@
         <w:t>).</w:t>
       </w:r>
     </w:p>
+    <w:p>
+      <w:pPr>
+        <w:rPr>
+          <w:lang w:val="en-US"/>
+        </w:rPr>
+      </w:pPr>
+      <w:r>
+        <w:rPr>
+          <w:lang w:val="en-US"/>
+        </w:rPr>
+        <w:t>git add 2s.docx</w:t>
+      </w:r>
+    </w:p>
+    <w:p>
+      <w:pPr>
+        <w:rPr>
+          <w:lang w:val="en-US"/>
+        </w:rPr>
+      </w:pPr>
+      <w:r>
+        <w:rPr>
+          <w:lang w:val="en-US"/>
+        </w:rPr>
+        <w:t>git commit -m “</w:t>
+      </w:r>
+      <w:r>
+        <w:rPr>
+          <w:lang w:val="en-US"/>
+        </w:rPr>
+        <w:t xml:space="preserve">added </w:t>
+      </w:r>
+      <w:proofErr w:type="spellStart"/>
+      <w:r>
+        <w:rPr>
+          <w:lang w:val="en-US"/>
+        </w:rPr>
+        <w:t>Kakulin</w:t>
+      </w:r>
+      <w:proofErr w:type="spellEnd"/>
+      <w:r>
+        <w:rPr>
+          <w:lang w:val="en-US"/>
+        </w:rPr>
+        <w:t xml:space="preserve"> student report</w:t>
+      </w:r>
+      <w:r>
+        <w:rPr>
+          <w:lang w:val="en-US"/>
+        </w:rPr>
+        <w:t>”</w:t>
+      </w:r>
+    </w:p>
+    <w:p>
+      <w:pPr>
+        <w:jc w:val="center"/>
+        <w:rPr>
+          <w:lang w:val="en-US"/>
+        </w:rPr>
+      </w:pPr>
+      <w:r>
+        <w:rPr>
+          <w:noProof/>
+          <w:lang w:val="en-US"/>
+        </w:rPr>
+        <w:drawing>
+          <wp:inline distT="0" distB="0" distL="0" distR="0" wp14:anchorId="7D75DAF8" wp14:editId="7553AE18">
+            <wp:extent cx="4843145" cy="618142"/>
+            <wp:effectExtent l="0" t="0" r="0" b="0"/>
+            <wp:docPr id="1932985405" name="Рисунок 1"/>
+            <wp:cNvGraphicFramePr>
+              <a:graphicFrameLocks xmlns:a="http://schemas.openxmlformats.org/drawingml/2006/main" noChangeAspect="1"/>
+            </wp:cNvGraphicFramePr>
+            <a:graphic xmlns:a="http://schemas.openxmlformats.org/drawingml/2006/main">
+              <a:graphicData uri="http://schemas.openxmlformats.org/drawingml/2006/picture">
+                <pic:pic xmlns:pic="http://schemas.openxmlformats.org/drawingml/2006/picture">
+                  <pic:nvPicPr>
+                    <pic:cNvPr id="1932985405" name=""/>
+                    <pic:cNvPicPr/>
+                  </pic:nvPicPr>
+                  <pic:blipFill>
+                    <a:blip r:embed="rId11"/>
+                    <a:stretch>
+                      <a:fillRect/>
+                    </a:stretch>
+                  </pic:blipFill>
+                  <pic:spPr>
+                    <a:xfrm>
+                      <a:off x="0" y="0"/>
+                      <a:ext cx="4871497" cy="621761"/>
+                    </a:xfrm>
+                    <a:prstGeom prst="rect">
+                      <a:avLst/>
+                    </a:prstGeom>
+                  </pic:spPr>
+                </pic:pic>
+              </a:graphicData>
+            </a:graphic>
+          </wp:inline>
+        </w:drawing>
+      </w:r>
+    </w:p>
+    <w:p>
+      <w:r>
+        <w:t xml:space="preserve">4.5 </w:t>
+      </w:r>
+      <w:r>
+        <w:t xml:space="preserve">Отправка ветки на </w:t>
+      </w:r>
+      <w:r>
+        <w:rPr>
+          <w:lang w:val="en-US"/>
+        </w:rPr>
+        <w:t>GitHub</w:t>
+      </w:r>
+      <w:r>
+        <w:t>.</w:t>
+      </w:r>
+    </w:p>
+    <w:p>
+      <w:r>
+        <w:lastRenderedPageBreak/>
+        <w:t>Чтобы мои изменения сохранились на удалённом сервере, я отправил ветку </w:t>
+      </w:r>
+      <w:proofErr w:type="spellStart"/>
+      <w:r>
+        <w:rPr>
+          <w:lang w:val="en-US"/>
+        </w:rPr>
+        <w:t>Kakulin</w:t>
+      </w:r>
+      <w:proofErr w:type="spellEnd"/>
+      <w:r>
+        <w:t> в репозиторий:</w:t>
+      </w:r>
+    </w:p>
+    <w:p>
+      <w:pPr>
+        <w:jc w:val="center"/>
+      </w:pPr>
+      <w:r>
+        <w:rPr>
+          <w:noProof/>
+        </w:rPr>
+        <w:drawing>
+          <wp:inline distT="0" distB="0" distL="0" distR="0" wp14:anchorId="797EF688" wp14:editId="005A2054">
+            <wp:extent cx="4965065" cy="1043433"/>
+            <wp:effectExtent l="0" t="0" r="6985" b="4445"/>
+            <wp:docPr id="2056990642" name="Рисунок 1"/>
+            <wp:cNvGraphicFramePr>
+              <a:graphicFrameLocks xmlns:a="http://schemas.openxmlformats.org/drawingml/2006/main" noChangeAspect="1"/>
+            </wp:cNvGraphicFramePr>
+            <a:graphic xmlns:a="http://schemas.openxmlformats.org/drawingml/2006/main">
+              <a:graphicData uri="http://schemas.openxmlformats.org/drawingml/2006/picture">
+                <pic:pic xmlns:pic="http://schemas.openxmlformats.org/drawingml/2006/picture">
+                  <pic:nvPicPr>
+                    <pic:cNvPr id="2056990642" name=""/>
+                    <pic:cNvPicPr/>
+                  </pic:nvPicPr>
+                  <pic:blipFill>
+                    <a:blip r:embed="rId12"/>
+                    <a:stretch>
+                      <a:fillRect/>
+                    </a:stretch>
+                  </pic:blipFill>
+                  <pic:spPr>
+                    <a:xfrm>
+                      <a:off x="0" y="0"/>
+                      <a:ext cx="4974935" cy="1045507"/>
+                    </a:xfrm>
+                    <a:prstGeom prst="rect">
+                      <a:avLst/>
+                    </a:prstGeom>
+                  </pic:spPr>
+                </pic:pic>
+              </a:graphicData>
+            </a:graphic>
+          </wp:inline>
+        </w:drawing>
+      </w:r>
+    </w:p>
+    <w:p>
+      <w:r>
+        <w:t xml:space="preserve">5. Слияние с веткой </w:t>
+      </w:r>
+      <w:r>
+        <w:rPr>
+          <w:lang w:val="en-US"/>
+        </w:rPr>
+        <w:t>master</w:t>
+      </w:r>
+    </w:p>
+    <w:p>
+      <w:r>
+        <w:t>После того как координатор проверил мои изменения и дал разрешение на слияние, я выполнил следующие шаги:</w:t>
+      </w:r>
+    </w:p>
+    <w:p>
+      <w:pPr>
+        <w:numPr>
+          <w:ilvl w:val="0"/>
+          <w:numId w:val="3"/>
+        </w:numPr>
+        <w:spacing w:line="276" w:lineRule="auto"/>
+      </w:pPr>
+      <w:r>
+        <w:rPr>
+          <w:b/>
+          <w:bCs/>
+        </w:rPr>
+        <w:t>Обновил локальную ветку </w:t>
+      </w:r>
+      <w:proofErr w:type="spellStart"/>
+      <w:r>
+        <w:t>master</w:t>
+      </w:r>
+      <w:proofErr w:type="spellEnd"/>
+      <w:r>
+        <w:t> (на случай, если за время работы в неё были добавлены изменения от других участников):</w:t>
+      </w:r>
+    </w:p>
+    <w:p>
+      <w:pPr>
+        <w:rPr>
+          <w:lang w:val="en-US"/>
+        </w:rPr>
+      </w:pPr>
+      <w:r>
+        <w:rPr>
+          <w:lang w:val="en-US"/>
+        </w:rPr>
+        <w:t>git checkout master</w:t>
+      </w:r>
+    </w:p>
+    <w:p>
+      <w:pPr>
+        <w:rPr>
+          <w:lang w:val="en-US"/>
+        </w:rPr>
+      </w:pPr>
+      <w:r>
+        <w:rPr>
+          <w:lang w:val="en-US"/>
+        </w:rPr>
+        <w:t>git pull origin master</w:t>
+      </w:r>
+    </w:p>
+    <w:p>
+      <w:pPr>
+        <w:jc w:val="center"/>
+        <w:rPr>
+          <w:lang w:val="en-US"/>
+        </w:rPr>
+      </w:pPr>
+      <w:r>
+        <w:rPr>
+          <w:noProof/>
+        </w:rPr>
+        <w:drawing>
+          <wp:inline distT="0" distB="0" distL="0" distR="0" wp14:anchorId="16A638B2" wp14:editId="4F699C49">
+            <wp:extent cx="5026025" cy="1256641"/>
+            <wp:effectExtent l="0" t="0" r="3175" b="1270"/>
+            <wp:docPr id="313198906" name="Рисунок 1"/>
+            <wp:cNvGraphicFramePr>
+              <a:graphicFrameLocks xmlns:a="http://schemas.openxmlformats.org/drawingml/2006/main" noChangeAspect="1"/>
+            </wp:cNvGraphicFramePr>
+            <a:graphic xmlns:a="http://schemas.openxmlformats.org/drawingml/2006/main">
+              <a:graphicData uri="http://schemas.openxmlformats.org/drawingml/2006/picture">
+                <pic:pic xmlns:pic="http://schemas.openxmlformats.org/drawingml/2006/picture">
+                  <pic:nvPicPr>
+                    <pic:cNvPr id="313198906" name=""/>
+                    <pic:cNvPicPr/>
+                  </pic:nvPicPr>
+                  <pic:blipFill>
+                    <a:blip r:embed="rId13"/>
+                    <a:stretch>
+                      <a:fillRect/>
+                    </a:stretch>
+                  </pic:blipFill>
+                  <pic:spPr>
+                    <a:xfrm>
+                      <a:off x="0" y="0"/>
+                      <a:ext cx="5059242" cy="1264946"/>
+                    </a:xfrm>
+                    <a:prstGeom prst="rect">
+                      <a:avLst/>
+                    </a:prstGeom>
+                  </pic:spPr>
+                </pic:pic>
+              </a:graphicData>
+            </a:graphic>
+          </wp:inline>
+        </w:drawing>
+      </w:r>
+    </w:p>
+    <w:p>
+      <w:pPr>
+        <w:pStyle w:val="a7"/>
+        <w:numPr>
+          <w:ilvl w:val="0"/>
+          <w:numId w:val="3"/>
+        </w:numPr>
+      </w:pPr>
+      <w:r>
+        <w:rPr>
+          <w:b/>
+          <w:bCs/>
+        </w:rPr>
+        <w:t>Выполнил слияние своей ветки </w:t>
+      </w:r>
+      <w:proofErr w:type="spellStart"/>
+      <w:r>
+        <w:rPr>
+          <w:lang w:val="en-US"/>
+        </w:rPr>
+        <w:t>Kakulin</w:t>
+      </w:r>
+      <w:proofErr w:type="spellEnd"/>
+      <w:r>
+        <w:rPr>
+          <w:b/>
+          <w:bCs/>
+        </w:rPr>
+        <w:t> в </w:t>
+      </w:r>
+      <w:proofErr w:type="spellStart"/>
+      <w:r>
+        <w:t>master</w:t>
+      </w:r>
+      <w:proofErr w:type="spellEnd"/>
+      <w:r>
+        <w:t>:</w:t>
+      </w:r>
+    </w:p>
+    <w:p>
+      <w:pPr>
+        <w:jc w:val="center"/>
+        <w:rPr>
+          <w:lang w:val="en-US"/>
+        </w:rPr>
+      </w:pPr>
+      <w:r>
+        <w:rPr>
+          <w:lang w:val="en-US"/>
+        </w:rPr>
+        <w:drawing>
+          <wp:inline distT="0" distB="0" distL="0" distR="0" wp14:anchorId="586743E0" wp14:editId="5B789CA7">
+            <wp:extent cx="3375241" cy="3810000"/>
+            <wp:effectExtent l="0" t="0" r="0" b="0"/>
+            <wp:docPr id="982734888" name="Рисунок 1"/>
+            <wp:cNvGraphicFramePr>
+              <a:graphicFrameLocks xmlns:a="http://schemas.openxmlformats.org/drawingml/2006/main" noChangeAspect="1"/>
+            </wp:cNvGraphicFramePr>
+            <a:graphic xmlns:a="http://schemas.openxmlformats.org/drawingml/2006/main">
+              <a:graphicData uri="http://schemas.openxmlformats.org/drawingml/2006/picture">
+                <pic:pic xmlns:pic="http://schemas.openxmlformats.org/drawingml/2006/picture">
+                  <pic:nvPicPr>
+                    <pic:cNvPr id="982734888" name=""/>
+                    <pic:cNvPicPr/>
+                  </pic:nvPicPr>
+                  <pic:blipFill>
+                    <a:blip r:embed="rId14"/>
+                    <a:stretch>
+                      <a:fillRect/>
+                    </a:stretch>
+                  </pic:blipFill>
+                  <pic:spPr>
+                    <a:xfrm>
+                      <a:off x="0" y="0"/>
+                      <a:ext cx="3380724" cy="3816189"/>
+                    </a:xfrm>
+                    <a:prstGeom prst="rect">
+                      <a:avLst/>
+                    </a:prstGeom>
+                  </pic:spPr>
+                </pic:pic>
+              </a:graphicData>
+            </a:graphic>
+          </wp:inline>
+        </w:drawing>
+      </w:r>
+    </w:p>
+    <w:p>
+      <w:pPr>
+        <w:pStyle w:val="a7"/>
+        <w:numPr>
+          <w:ilvl w:val="0"/>
+          <w:numId w:val="3"/>
+        </w:numPr>
+      </w:pPr>
+      <w:r>
+        <w:rPr>
+          <w:b/>
+          <w:bCs/>
+        </w:rPr>
+        <w:t>Отправил обновлённую ветку </w:t>
+      </w:r>
+      <w:proofErr w:type="spellStart"/>
+      <w:r>
+        <w:t>master</w:t>
+      </w:r>
+      <w:proofErr w:type="spellEnd"/>
+      <w:r>
+        <w:rPr>
+          <w:b/>
+          <w:bCs/>
+        </w:rPr>
+        <w:t xml:space="preserve"> на </w:t>
+      </w:r>
+      <w:proofErr w:type="spellStart"/>
+      <w:r>
+        <w:rPr>
+          <w:b/>
+          <w:bCs/>
+        </w:rPr>
+        <w:t>GitHub</w:t>
+      </w:r>
+      <w:proofErr w:type="spellEnd"/>
+      <w:r>
+        <w:t>:</w:t>
+      </w:r>
+    </w:p>
+    <w:p>
+      <w:pPr>
+        <w:rPr>
+          <w:lang w:val="en-US"/>
+        </w:rPr>
+      </w:pPr>
+      <w:r>
+        <w:rPr>
+          <w:lang w:val="en-US"/>
+        </w:rPr>
+        <w:lastRenderedPageBreak/>
+        <w:t>git push origin master</w:t>
+      </w:r>
+    </w:p>
+    <w:p>
+      <w:pPr>
+        <w:jc w:val="center"/>
+      </w:pPr>
+      <w:r>
+        <w:drawing>
+          <wp:inline distT="0" distB="0" distL="0" distR="0" wp14:anchorId="5BC4F0A6" wp14:editId="0D0C9802">
+            <wp:extent cx="4569558" cy="685800"/>
+            <wp:effectExtent l="0" t="0" r="2540" b="0"/>
+            <wp:docPr id="363128843" name="Рисунок 1"/>
+            <wp:cNvGraphicFramePr>
+              <a:graphicFrameLocks xmlns:a="http://schemas.openxmlformats.org/drawingml/2006/main" noChangeAspect="1"/>
+            </wp:cNvGraphicFramePr>
+            <a:graphic xmlns:a="http://schemas.openxmlformats.org/drawingml/2006/main">
+              <a:graphicData uri="http://schemas.openxmlformats.org/drawingml/2006/picture">
+                <pic:pic xmlns:pic="http://schemas.openxmlformats.org/drawingml/2006/picture">
+                  <pic:nvPicPr>
+                    <pic:cNvPr id="363128843" name=""/>
+                    <pic:cNvPicPr/>
+                  </pic:nvPicPr>
+                  <pic:blipFill>
+                    <a:blip r:embed="rId15"/>
+                    <a:stretch>
+                      <a:fillRect/>
+                    </a:stretch>
+                  </pic:blipFill>
+                  <pic:spPr>
+                    <a:xfrm>
+                      <a:off x="0" y="0"/>
+                      <a:ext cx="4575113" cy="686634"/>
+                    </a:xfrm>
+                    <a:prstGeom prst="rect">
+                      <a:avLst/>
+                    </a:prstGeom>
+                  </pic:spPr>
+                </pic:pic>
+              </a:graphicData>
+            </a:graphic>
+          </wp:inline>
+        </w:drawing>
+      </w:r>
+    </w:p>
+    <w:p>
+      <w:r>
+        <w:rPr>
+          <w:lang w:val="en-US"/>
+        </w:rPr>
+        <w:t xml:space="preserve">6. </w:t>
+      </w:r>
+      <w:r>
+        <w:t>Итог.</w:t>
+      </w:r>
+    </w:p>
+    <w:p>
+      <w:r>
+        <w:t>В результате моей работы:</w:t>
+      </w:r>
+    </w:p>
+    <w:p>
+      <w:pPr>
+        <w:numPr>
+          <w:ilvl w:val="0"/>
+          <w:numId w:val="5"/>
+        </w:numPr>
+      </w:pPr>
+      <w:r>
+        <w:t>В общ</w:t>
+      </w:r>
+      <w:r>
+        <w:t>ем</w:t>
+      </w:r>
+      <w:r>
+        <w:t xml:space="preserve"> </w:t>
+      </w:r>
+      <w:r>
+        <w:t>репозитори</w:t>
+      </w:r>
+      <w:r>
+        <w:t>и</w:t>
+      </w:r>
+      <w:r>
+        <w:t> LR9Finalwork </w:t>
+      </w:r>
+      <w:r>
+        <w:t>изменено объявление переменных (на каждой строке одно объявление)</w:t>
+      </w:r>
+      <w:r>
+        <w:t>.</w:t>
+      </w:r>
+    </w:p>
+    <w:p>
+      <w:pPr>
+        <w:numPr>
+          <w:ilvl w:val="0"/>
+          <w:numId w:val="5"/>
+        </w:numPr>
+      </w:pPr>
+      <w:r>
+        <w:t xml:space="preserve">В </w:t>
+      </w:r>
+      <w:r>
+        <w:t>код добавлены комментарии к каждой переменной, отвечающие за пояснение их работы.</w:t>
+      </w:r>
+    </w:p>
+    <w:p>
+      <w:pPr>
+        <w:numPr>
+          <w:ilvl w:val="0"/>
+          <w:numId w:val="5"/>
+        </w:numPr>
+      </w:pPr>
+      <w:r>
+        <w:t>Мой отчёт </w:t>
+      </w:r>
+      <w:r>
+        <w:t>2</w:t>
+      </w:r>
+      <w:r>
+        <w:rPr>
+          <w:lang w:val="en-US"/>
+        </w:rPr>
+        <w:t>s</w:t>
+      </w:r>
+      <w:r>
+        <w:t>.</w:t>
+      </w:r>
+      <w:proofErr w:type="spellStart"/>
+      <w:r>
+        <w:t>docx</w:t>
+      </w:r>
+      <w:proofErr w:type="spellEnd"/>
+      <w:r>
+        <w:t> с описанием действий и скриншотами сохранён в репозитории.</w:t>
+      </w:r>
+    </w:p>
+    <w:p>
+      <w:pPr>
+        <w:numPr>
+          <w:ilvl w:val="0"/>
+          <w:numId w:val="5"/>
+        </w:numPr>
+      </w:pPr>
+      <w:r>
+        <w:t>Все изменения прошли проверку координатором и успешно слиты с главной веткой.</w:t>
+      </w:r>
+    </w:p>
+    <w:p>
+      <w:r>
+        <w:rPr>
+          <w:b/>
+          <w:bCs/>
+        </w:rPr>
+        <w:t>Ссылка на совместный репозиторий:</w:t>
+      </w:r>
+      <w:r>
+        <w:t> </w:t>
+      </w:r>
+      <w:hyperlink r:id="rId16" w:tgtFrame="_blank" w:history="1">
+        <w:r>
+          <w:rPr>
+            <w:rStyle w:val="ac"/>
+          </w:rPr>
+          <w:t>https://github.com/DaNte1s/LR9Finalwork</w:t>
+        </w:r>
+      </w:hyperlink>
+    </w:p>
+    <w:p/>
+    <w:p/>
+    <w:p/>
     <w:p/>
     <w:p>
       <w:pPr>
@@ -705,8 +1352,493 @@
       </w:rPr>
     </w:lvl>
   </w:abstractNum>
+  <w:abstractNum w:abstractNumId="1" w15:restartNumberingAfterBreak="0">
+    <w:nsid w:val="1DB855D6"/>
+    <w:multiLevelType w:val="hybridMultilevel"/>
+    <w:tmpl w:val="60EA4932"/>
+    <w:lvl w:ilvl="0" w:tplc="0419000F">
+      <w:start w:val="1"/>
+      <w:numFmt w:val="decimal"/>
+      <w:lvlText w:val="%1."/>
+      <w:lvlJc w:val="left"/>
+      <w:pPr>
+        <w:ind w:left="720" w:hanging="360"/>
+      </w:pPr>
+    </w:lvl>
+    <w:lvl w:ilvl="1" w:tplc="04190019" w:tentative="1">
+      <w:start w:val="1"/>
+      <w:numFmt w:val="lowerLetter"/>
+      <w:lvlText w:val="%2."/>
+      <w:lvlJc w:val="left"/>
+      <w:pPr>
+        <w:ind w:left="1440" w:hanging="360"/>
+      </w:pPr>
+    </w:lvl>
+    <w:lvl w:ilvl="2" w:tplc="0419001B" w:tentative="1">
+      <w:start w:val="1"/>
+      <w:numFmt w:val="lowerRoman"/>
+      <w:lvlText w:val="%3."/>
+      <w:lvlJc w:val="right"/>
+      <w:pPr>
+        <w:ind w:left="2160" w:hanging="180"/>
+      </w:pPr>
+    </w:lvl>
+    <w:lvl w:ilvl="3" w:tplc="0419000F" w:tentative="1">
+      <w:start w:val="1"/>
+      <w:numFmt w:val="decimal"/>
+      <w:lvlText w:val="%4."/>
+      <w:lvlJc w:val="left"/>
+      <w:pPr>
+        <w:ind w:left="2880" w:hanging="360"/>
+      </w:pPr>
+    </w:lvl>
+    <w:lvl w:ilvl="4" w:tplc="04190019" w:tentative="1">
+      <w:start w:val="1"/>
+      <w:numFmt w:val="lowerLetter"/>
+      <w:lvlText w:val="%5."/>
+      <w:lvlJc w:val="left"/>
+      <w:pPr>
+        <w:ind w:left="3600" w:hanging="360"/>
+      </w:pPr>
+    </w:lvl>
+    <w:lvl w:ilvl="5" w:tplc="0419001B" w:tentative="1">
+      <w:start w:val="1"/>
+      <w:numFmt w:val="lowerRoman"/>
+      <w:lvlText w:val="%6."/>
+      <w:lvlJc w:val="right"/>
+      <w:pPr>
+        <w:ind w:left="4320" w:hanging="180"/>
+      </w:pPr>
+    </w:lvl>
+    <w:lvl w:ilvl="6" w:tplc="0419000F" w:tentative="1">
+      <w:start w:val="1"/>
+      <w:numFmt w:val="decimal"/>
+      <w:lvlText w:val="%7."/>
+      <w:lvlJc w:val="left"/>
+      <w:pPr>
+        <w:ind w:left="5040" w:hanging="360"/>
+      </w:pPr>
+    </w:lvl>
+    <w:lvl w:ilvl="7" w:tplc="04190019" w:tentative="1">
+      <w:start w:val="1"/>
+      <w:numFmt w:val="lowerLetter"/>
+      <w:lvlText w:val="%8."/>
+      <w:lvlJc w:val="left"/>
+      <w:pPr>
+        <w:ind w:left="5760" w:hanging="360"/>
+      </w:pPr>
+    </w:lvl>
+    <w:lvl w:ilvl="8" w:tplc="0419001B" w:tentative="1">
+      <w:start w:val="1"/>
+      <w:numFmt w:val="lowerRoman"/>
+      <w:lvlText w:val="%9."/>
+      <w:lvlJc w:val="right"/>
+      <w:pPr>
+        <w:ind w:left="6480" w:hanging="180"/>
+      </w:pPr>
+    </w:lvl>
+  </w:abstractNum>
+  <w:abstractNum w:abstractNumId="2" w15:restartNumberingAfterBreak="0">
+    <w:nsid w:val="252069C2"/>
+    <w:multiLevelType w:val="hybridMultilevel"/>
+    <w:tmpl w:val="0C9291F8"/>
+    <w:lvl w:ilvl="0" w:tplc="C778F7D6">
+      <w:start w:val="1"/>
+      <w:numFmt w:val="decimal"/>
+      <w:lvlText w:val="%1"/>
+      <w:lvlJc w:val="center"/>
+      <w:pPr>
+        <w:ind w:left="720" w:hanging="360"/>
+      </w:pPr>
+      <w:rPr>
+        <w:rFonts w:hint="default"/>
+      </w:rPr>
+    </w:lvl>
+    <w:lvl w:ilvl="1" w:tplc="04190019" w:tentative="1">
+      <w:start w:val="1"/>
+      <w:numFmt w:val="lowerLetter"/>
+      <w:lvlText w:val="%2."/>
+      <w:lvlJc w:val="left"/>
+      <w:pPr>
+        <w:ind w:left="1440" w:hanging="360"/>
+      </w:pPr>
+    </w:lvl>
+    <w:lvl w:ilvl="2" w:tplc="0419001B" w:tentative="1">
+      <w:start w:val="1"/>
+      <w:numFmt w:val="lowerRoman"/>
+      <w:lvlText w:val="%3."/>
+      <w:lvlJc w:val="right"/>
+      <w:pPr>
+        <w:ind w:left="2160" w:hanging="180"/>
+      </w:pPr>
+    </w:lvl>
+    <w:lvl w:ilvl="3" w:tplc="0419000F" w:tentative="1">
+      <w:start w:val="1"/>
+      <w:numFmt w:val="decimal"/>
+      <w:lvlText w:val="%4."/>
+      <w:lvlJc w:val="left"/>
+      <w:pPr>
+        <w:ind w:left="2880" w:hanging="360"/>
+      </w:pPr>
+    </w:lvl>
+    <w:lvl w:ilvl="4" w:tplc="04190019" w:tentative="1">
+      <w:start w:val="1"/>
+      <w:numFmt w:val="lowerLetter"/>
+      <w:lvlText w:val="%5."/>
+      <w:lvlJc w:val="left"/>
+      <w:pPr>
+        <w:ind w:left="3600" w:hanging="360"/>
+      </w:pPr>
+    </w:lvl>
+    <w:lvl w:ilvl="5" w:tplc="0419001B" w:tentative="1">
+      <w:start w:val="1"/>
+      <w:numFmt w:val="lowerRoman"/>
+      <w:lvlText w:val="%6."/>
+      <w:lvlJc w:val="right"/>
+      <w:pPr>
+        <w:ind w:left="4320" w:hanging="180"/>
+      </w:pPr>
+    </w:lvl>
+    <w:lvl w:ilvl="6" w:tplc="0419000F" w:tentative="1">
+      <w:start w:val="1"/>
+      <w:numFmt w:val="decimal"/>
+      <w:lvlText w:val="%7."/>
+      <w:lvlJc w:val="left"/>
+      <w:pPr>
+        <w:ind w:left="5040" w:hanging="360"/>
+      </w:pPr>
+    </w:lvl>
+    <w:lvl w:ilvl="7" w:tplc="04190019" w:tentative="1">
+      <w:start w:val="1"/>
+      <w:numFmt w:val="lowerLetter"/>
+      <w:lvlText w:val="%8."/>
+      <w:lvlJc w:val="left"/>
+      <w:pPr>
+        <w:ind w:left="5760" w:hanging="360"/>
+      </w:pPr>
+    </w:lvl>
+    <w:lvl w:ilvl="8" w:tplc="0419001B" w:tentative="1">
+      <w:start w:val="1"/>
+      <w:numFmt w:val="lowerRoman"/>
+      <w:lvlText w:val="%9."/>
+      <w:lvlJc w:val="right"/>
+      <w:pPr>
+        <w:ind w:left="6480" w:hanging="180"/>
+      </w:pPr>
+    </w:lvl>
+  </w:abstractNum>
+  <w:abstractNum w:abstractNumId="3" w15:restartNumberingAfterBreak="0">
+    <w:nsid w:val="37D76882"/>
+    <w:multiLevelType w:val="multilevel"/>
+    <w:tmpl w:val="11683D22"/>
+    <w:lvl w:ilvl="0">
+      <w:start w:val="1"/>
+      <w:numFmt w:val="decimal"/>
+      <w:lvlText w:val="%1."/>
+      <w:lvlJc w:val="left"/>
+      <w:pPr>
+        <w:tabs>
+          <w:tab w:val="num" w:pos="720"/>
+        </w:tabs>
+        <w:ind w:left="720" w:hanging="360"/>
+      </w:pPr>
+    </w:lvl>
+    <w:lvl w:ilvl="1">
+      <w:start w:val="1"/>
+      <w:numFmt w:val="decimal"/>
+      <w:lvlText w:val="%2."/>
+      <w:lvlJc w:val="left"/>
+      <w:pPr>
+        <w:tabs>
+          <w:tab w:val="num" w:pos="1440"/>
+        </w:tabs>
+        <w:ind w:left="1440" w:hanging="360"/>
+      </w:pPr>
+    </w:lvl>
+    <w:lvl w:ilvl="2">
+      <w:start w:val="1"/>
+      <w:numFmt w:val="decimal"/>
+      <w:lvlText w:val="%3."/>
+      <w:lvlJc w:val="left"/>
+      <w:pPr>
+        <w:tabs>
+          <w:tab w:val="num" w:pos="2160"/>
+        </w:tabs>
+        <w:ind w:left="2160" w:hanging="360"/>
+      </w:pPr>
+    </w:lvl>
+    <w:lvl w:ilvl="3">
+      <w:start w:val="1"/>
+      <w:numFmt w:val="decimal"/>
+      <w:lvlText w:val="%4."/>
+      <w:lvlJc w:val="left"/>
+      <w:pPr>
+        <w:tabs>
+          <w:tab w:val="num" w:pos="2880"/>
+        </w:tabs>
+        <w:ind w:left="2880" w:hanging="360"/>
+      </w:pPr>
+    </w:lvl>
+    <w:lvl w:ilvl="4">
+      <w:start w:val="1"/>
+      <w:numFmt w:val="decimal"/>
+      <w:lvlText w:val="%5."/>
+      <w:lvlJc w:val="left"/>
+      <w:pPr>
+        <w:tabs>
+          <w:tab w:val="num" w:pos="3600"/>
+        </w:tabs>
+        <w:ind w:left="3600" w:hanging="360"/>
+      </w:pPr>
+    </w:lvl>
+    <w:lvl w:ilvl="5">
+      <w:start w:val="1"/>
+      <w:numFmt w:val="decimal"/>
+      <w:lvlText w:val="%6."/>
+      <w:lvlJc w:val="left"/>
+      <w:pPr>
+        <w:tabs>
+          <w:tab w:val="num" w:pos="4320"/>
+        </w:tabs>
+        <w:ind w:left="4320" w:hanging="360"/>
+      </w:pPr>
+    </w:lvl>
+    <w:lvl w:ilvl="6">
+      <w:start w:val="1"/>
+      <w:numFmt w:val="decimal"/>
+      <w:lvlText w:val="%7."/>
+      <w:lvlJc w:val="left"/>
+      <w:pPr>
+        <w:tabs>
+          <w:tab w:val="num" w:pos="5040"/>
+        </w:tabs>
+        <w:ind w:left="5040" w:hanging="360"/>
+      </w:pPr>
+    </w:lvl>
+    <w:lvl w:ilvl="7">
+      <w:start w:val="1"/>
+      <w:numFmt w:val="decimal"/>
+      <w:lvlText w:val="%8."/>
+      <w:lvlJc w:val="left"/>
+      <w:pPr>
+        <w:tabs>
+          <w:tab w:val="num" w:pos="5760"/>
+        </w:tabs>
+        <w:ind w:left="5760" w:hanging="360"/>
+      </w:pPr>
+    </w:lvl>
+    <w:lvl w:ilvl="8">
+      <w:start w:val="1"/>
+      <w:numFmt w:val="decimal"/>
+      <w:lvlText w:val="%9."/>
+      <w:lvlJc w:val="left"/>
+      <w:pPr>
+        <w:tabs>
+          <w:tab w:val="num" w:pos="6480"/>
+        </w:tabs>
+        <w:ind w:left="6480" w:hanging="360"/>
+      </w:pPr>
+    </w:lvl>
+  </w:abstractNum>
+  <w:abstractNum w:abstractNumId="4" w15:restartNumberingAfterBreak="0">
+    <w:nsid w:val="466E392A"/>
+    <w:multiLevelType w:val="multilevel"/>
+    <w:tmpl w:val="7746332E"/>
+    <w:lvl w:ilvl="0">
+      <w:start w:val="1"/>
+      <w:numFmt w:val="bullet"/>
+      <w:lvlText w:val=""/>
+      <w:lvlJc w:val="left"/>
+      <w:pPr>
+        <w:tabs>
+          <w:tab w:val="num" w:pos="720"/>
+        </w:tabs>
+        <w:ind w:left="720" w:hanging="360"/>
+      </w:pPr>
+      <w:rPr>
+        <w:rFonts w:ascii="Symbol" w:hAnsi="Symbol" w:hint="default"/>
+        <w:sz w:val="20"/>
+      </w:rPr>
+    </w:lvl>
+    <w:lvl w:ilvl="1">
+      <w:start w:val="1"/>
+      <w:numFmt w:val="bullet"/>
+      <w:lvlText w:val="o"/>
+      <w:lvlJc w:val="left"/>
+      <w:pPr>
+        <w:tabs>
+          <w:tab w:val="num" w:pos="1440"/>
+        </w:tabs>
+        <w:ind w:left="1440" w:hanging="360"/>
+      </w:pPr>
+      <w:rPr>
+        <w:rFonts w:ascii="Courier New" w:hAnsi="Courier New" w:cs="Times New Roman" w:hint="default"/>
+        <w:sz w:val="20"/>
+      </w:rPr>
+    </w:lvl>
+    <w:lvl w:ilvl="2">
+      <w:start w:val="1"/>
+      <w:numFmt w:val="bullet"/>
+      <w:lvlText w:val=""/>
+      <w:lvlJc w:val="left"/>
+      <w:pPr>
+        <w:tabs>
+          <w:tab w:val="num" w:pos="2160"/>
+        </w:tabs>
+        <w:ind w:left="2160" w:hanging="360"/>
+      </w:pPr>
+      <w:rPr>
+        <w:rFonts w:ascii="Wingdings" w:hAnsi="Wingdings" w:hint="default"/>
+        <w:sz w:val="20"/>
+      </w:rPr>
+    </w:lvl>
+    <w:lvl w:ilvl="3">
+      <w:start w:val="1"/>
+      <w:numFmt w:val="bullet"/>
+      <w:lvlText w:val=""/>
+      <w:lvlJc w:val="left"/>
+      <w:pPr>
+        <w:tabs>
+          <w:tab w:val="num" w:pos="2880"/>
+        </w:tabs>
+        <w:ind w:left="2880" w:hanging="360"/>
+      </w:pPr>
+      <w:rPr>
+        <w:rFonts w:ascii="Wingdings" w:hAnsi="Wingdings" w:hint="default"/>
+        <w:sz w:val="20"/>
+      </w:rPr>
+    </w:lvl>
+    <w:lvl w:ilvl="4">
+      <w:start w:val="1"/>
+      <w:numFmt w:val="bullet"/>
+      <w:lvlText w:val=""/>
+      <w:lvlJc w:val="left"/>
+      <w:pPr>
+        <w:tabs>
+          <w:tab w:val="num" w:pos="3600"/>
+        </w:tabs>
+        <w:ind w:left="3600" w:hanging="360"/>
+      </w:pPr>
+      <w:rPr>
+        <w:rFonts w:ascii="Wingdings" w:hAnsi="Wingdings" w:hint="default"/>
+        <w:sz w:val="20"/>
+      </w:rPr>
+    </w:lvl>
+    <w:lvl w:ilvl="5">
+      <w:start w:val="1"/>
+      <w:numFmt w:val="bullet"/>
+      <w:lvlText w:val=""/>
+      <w:lvlJc w:val="left"/>
+      <w:pPr>
+        <w:tabs>
+          <w:tab w:val="num" w:pos="4320"/>
+        </w:tabs>
+        <w:ind w:left="4320" w:hanging="360"/>
+      </w:pPr>
+      <w:rPr>
+        <w:rFonts w:ascii="Wingdings" w:hAnsi="Wingdings" w:hint="default"/>
+        <w:sz w:val="20"/>
+      </w:rPr>
+    </w:lvl>
+    <w:lvl w:ilvl="6">
+      <w:start w:val="1"/>
+      <w:numFmt w:val="bullet"/>
+      <w:lvlText w:val=""/>
+      <w:lvlJc w:val="left"/>
+      <w:pPr>
+        <w:tabs>
+          <w:tab w:val="num" w:pos="5040"/>
+        </w:tabs>
+        <w:ind w:left="5040" w:hanging="360"/>
+      </w:pPr>
+      <w:rPr>
+        <w:rFonts w:ascii="Wingdings" w:hAnsi="Wingdings" w:hint="default"/>
+        <w:sz w:val="20"/>
+      </w:rPr>
+    </w:lvl>
+    <w:lvl w:ilvl="7">
+      <w:start w:val="1"/>
+      <w:numFmt w:val="bullet"/>
+      <w:lvlText w:val=""/>
+      <w:lvlJc w:val="left"/>
+      <w:pPr>
+        <w:tabs>
+          <w:tab w:val="num" w:pos="5760"/>
+        </w:tabs>
+        <w:ind w:left="5760" w:hanging="360"/>
+      </w:pPr>
+      <w:rPr>
+        <w:rFonts w:ascii="Wingdings" w:hAnsi="Wingdings" w:hint="default"/>
+        <w:sz w:val="20"/>
+      </w:rPr>
+    </w:lvl>
+    <w:lvl w:ilvl="8">
+      <w:start w:val="1"/>
+      <w:numFmt w:val="bullet"/>
+      <w:lvlText w:val=""/>
+      <w:lvlJc w:val="left"/>
+      <w:pPr>
+        <w:tabs>
+          <w:tab w:val="num" w:pos="6480"/>
+        </w:tabs>
+        <w:ind w:left="6480" w:hanging="360"/>
+      </w:pPr>
+      <w:rPr>
+        <w:rFonts w:ascii="Wingdings" w:hAnsi="Wingdings" w:hint="default"/>
+        <w:sz w:val="20"/>
+      </w:rPr>
+    </w:lvl>
+  </w:abstractNum>
   <w:num w:numId="1" w16cid:durableId="262615336">
     <w:abstractNumId w:val="0"/>
+  </w:num>
+  <w:num w:numId="2" w16cid:durableId="1334453254">
+    <w:abstractNumId w:val="2"/>
+  </w:num>
+  <w:num w:numId="3" w16cid:durableId="613632211">
+    <w:abstractNumId w:val="1"/>
+  </w:num>
+  <w:num w:numId="4" w16cid:durableId="681663000">
+    <w:abstractNumId w:val="3"/>
+    <w:lvlOverride w:ilvl="0">
+      <w:startOverride w:val="1"/>
+    </w:lvlOverride>
+    <w:lvlOverride w:ilvl="1">
+      <w:startOverride w:val="1"/>
+    </w:lvlOverride>
+    <w:lvlOverride w:ilvl="2">
+      <w:startOverride w:val="1"/>
+    </w:lvlOverride>
+    <w:lvlOverride w:ilvl="3">
+      <w:startOverride w:val="1"/>
+    </w:lvlOverride>
+    <w:lvlOverride w:ilvl="4">
+      <w:startOverride w:val="1"/>
+    </w:lvlOverride>
+    <w:lvlOverride w:ilvl="5">
+      <w:startOverride w:val="1"/>
+    </w:lvlOverride>
+    <w:lvlOverride w:ilvl="6">
+      <w:startOverride w:val="1"/>
+    </w:lvlOverride>
+    <w:lvlOverride w:ilvl="7">
+      <w:startOverride w:val="1"/>
+    </w:lvlOverride>
+    <w:lvlOverride w:ilvl="8">
+      <w:startOverride w:val="1"/>
+    </w:lvlOverride>
+  </w:num>
+  <w:num w:numId="5" w16cid:durableId="528031732">
+    <w:abstractNumId w:val="4"/>
+    <w:lvlOverride w:ilvl="0"/>
+    <w:lvlOverride w:ilvl="1"/>
+    <w:lvlOverride w:ilvl="2"/>
+    <w:lvlOverride w:ilvl="3"/>
+    <w:lvlOverride w:ilvl="4"/>
+    <w:lvlOverride w:ilvl="5"/>
+    <w:lvlOverride w:ilvl="6"/>
+    <w:lvlOverride w:ilvl="7"/>
+    <w:lvlOverride w:ilvl="8"/>
   </w:num>
 </w:numbering>
 </file>

</xml_diff>